<commit_message>
Mark the v1 architecture superseded rather than leaving it readable as current
Both the .md and the .docx now open with a banner naming v2.1 as the current
architecture and listing the claims that are no longer true: the adapter
topology, the token budgets, the LoRA targets, the promotion gate, the
confidence method, the split unit, the serving formats, the trainer stack and
the stage count.

Kept rather than deleted: the v2.1 revision tables reference what v1 said and
why it changed, and a decision log is worth less without the decision it
reversed. But a superseded document that reads as current is the same failure as
the drifted combined spec -- two official-looking answers to the same question.

v2.1 itself is untouched. It is the source document, not an artifact of this
migration.
</commit_message>
<xml_diff>
--- a/Documentation/finetuning-architecture-v1.docx
+++ b/Documentation/finetuning-architecture-v1.docx
@@ -2,6 +2,30 @@
 <file path=word/document.xml><?xml version="1.0" encoding="utf-8"?>
 <w:document xmlns:w="http://schemas.openxmlformats.org/wordprocessingml/2006/main" xmlns:m="http://schemas.openxmlformats.org/officeDocument/2006/math" xmlns:r="http://schemas.openxmlformats.org/officeDocument/2006/relationships" xmlns:o="urn:schemas-microsoft-com:office:office" xmlns:v="urn:schemas-microsoft-com:vml" xmlns:w10="urn:schemas-microsoft-com:office:word" xmlns:a="http://schemas.openxmlformats.org/drawingml/2006/main" xmlns:pic="http://schemas.openxmlformats.org/drawingml/2006/picture" xmlns:wp="http://schemas.openxmlformats.org/drawingml/2006/wordprocessingDrawing">
   <w:body>
+    <w:p>
+      <w:pPr>
+        <w:pStyle w:val="Compact"/>
+        <w:ind w:left="360"/>
+      </w:pPr>
+      <w:r>
+        <w:rPr>
+          <w:b/>
+        </w:rPr>
+        <w:t>SUPERSEDED BY v2.1 — DO NOT IMPLEMENT FROM THIS DOCUMENT</w:t>
+      </w:r>
+    </w:p>
+    <w:p>
+      <w:pPr>
+        <w:pStyle w:val="Compact"/>
+        <w:ind w:left="360"/>
+      </w:pPr>
+      <w:r>
+        <w:rPr>
+          <w:b w:val="0"/>
+        </w:rPr>
+        <w:t>The current architecture is finetuning-architecture-v2.1.docx, and the codebase implements that one. This file is kept because the v2.1 revision tables reference what v1 said and why it changed — a decision log is worth less without the decision it reversed. Its central claims are no longer true: the adapter topology, the token budgets, the promotion gate, the confidence method, the split unit, the serving formats and the trainer stack have all been replaced. See the v1 Markdown file for a side-by-side table.</w:t>
+      </w:r>
+    </w:p>
     <w:p>
       <w:pPr>
         <w:pStyle w:val="Compact"/>

</xml_diff>